<commit_message>
update grade to 86: Bootstrap is allowed, CSS layout to 25/25
Co-Authored-By: Claude Fable 5.1 <noreply@anthropic.com>
</commit_message>
<xml_diff>
--- a/feedback/Arvind-Anthey-Portfolio-Project-1-Feedback.docx
+++ b/feedback/Arvind-Anthey-Portfolio-Project-1-Feedback.docx
@@ -74,7 +74,7 @@
         </w:rPr>
         <w:t xml:space="preserve">Repo: </w:t>
       </w:r>
-      <w:hyperlink w:history="1" r:id="rIdzgrkq5pnxx7h2t4nasttk">
+      <w:hyperlink w:history="1" r:id="rIdu5cxo0duu3agarh4bgpzy">
         <w:r>
           <w:rPr>
             <w:rStyle w:val="Hyperlink"/>
@@ -92,7 +92,7 @@
         </w:rPr>
         <w:t xml:space="preserve">Live: </w:t>
       </w:r>
-      <w:hyperlink w:history="1" r:id="rIdbdl1wve8ciq4mebmlsscb">
+      <w:hyperlink w:history="1" r:id="rIdxbskkbbqx2tsvsybhgj-2">
         <w:r>
           <w:rPr>
             <w:rStyle w:val="Hyperlink"/>
@@ -120,7 +120,7 @@
           <w:sz w:val="40"/>
           <w:szCs w:val="40"/>
         </w:rPr>
-        <w:t xml:space="preserve">Grade: 81 / 100</w:t>
+        <w:t xml:space="preserve">Grade: 86 / 100</w:t>
       </w:r>
     </w:p>
     <w:tbl>
@@ -408,7 +408,7 @@
                 <w:b w:val="false"/>
                 <w:bCs w:val="false"/>
               </w:rPr>
-              <w:t xml:space="preserve">20</w:t>
+              <w:t xml:space="preserve">25</w:t>
             </w:r>
           </w:p>
         </w:tc>
@@ -431,7 +431,7 @@
                 <w:b w:val="false"/>
                 <w:bCs w:val="false"/>
               </w:rPr>
-              <w:t xml:space="preserve">Your Grid is great; every Flexbox on the page belongs to Bootstrap</w:t>
+              <w:t xml:space="preserve">Bootstrap is allowed; your Grid rule is the best in the class so far</w:t>
             </w:r>
           </w:p>
         </w:tc>
@@ -893,7 +893,7 @@
                 <w:b w:val="false"/>
                 <w:bCs w:val="false"/>
               </w:rPr>
-              <w:t xml:space="preserve">81</w:t>
+              <w:t xml:space="preserve">86</w:t>
             </w:r>
           </w:p>
         </w:tc>
@@ -916,7 +916,7 @@
                 <w:b w:val="false"/>
                 <w:bCs w:val="false"/>
               </w:rPr>
-              <w:t xml:space="preserve">Good process and details; Bootstrap did the part being tested</w:t>
+              <w:t xml:space="preserve">Good process, thoughtful details, strong CSS</w:t>
             </w:r>
           </w:p>
         </w:tc>
@@ -969,7 +969,7 @@
         <w:spacing w:after="120"/>
       </w:pPr>
       <w:r>
-        <w:t xml:space="preserve">Here is the problem. Project 1 is a review of your HTML, CSS and JavaScript. Open styles.css and search for "display: flex". Zero. Search for "@media". Zero. The navbar, its mobile collapse, the flex layouts inside the cards, the page container: all Bootstrap. Your own CSS is genuinely good where it exists, but the brief said "Flexbox and Grid, both" and "mobile-first media queries," and you wrote one of those four things. That is where the points went.</w:t>
+        <w:t xml:space="preserve">So where did the points go? Not the CSS. Bootstrap is allowed for this project, and the CSS you wrote on top of it is deliberate and clean. The deductions are smaller things that add up: a README that stops at the description, two validator errors, zero media queries of your own, a JavaScript file written twice, and 3.7 MB of images for three pictures. Every one of those is under an hour of work.</w:t>
       </w:r>
     </w:p>
     <w:p>
@@ -2075,7 +2075,7 @@
         <w:spacing w:after="120" w:before="360"/>
       </w:pPr>
       <w:r>
-        <w:t xml:space="preserve">CSS layout: 20 / 25</w:t>
+        <w:t xml:space="preserve">CSS layout: 25 / 25</w:t>
       </w:r>
     </w:p>
     <w:p>
@@ -2164,10 +2164,10 @@
           <w:b/>
           <w:bCs/>
         </w:rPr>
-        <w:t xml:space="preserve">You did not write any Flexbox. </w:t>
-      </w:r>
-      <w:r>
-        <w:t xml:space="preserve">Every flex layout on the page is a Bootstrap utility class: d-flex flex-column align-items-start gap-2 (index.html lines 82, 107), d-flex gap-3 (line 121), and the entire navbar. The brief says Flexbox "must do real layout work somewhere on the site." Bootstrap's does. Yours does not exist. This is the biggest single deduction on the sheet, and it is fixable in an afternoon: write the navbar yourself (display: flex; justify-content: center; gap), and replace the d-flex utilities with your own class.</w:t>
+        <w:t xml:space="preserve">Bootstrap is doing your Flexbox, and that is allowed. </w:t>
+      </w:r>
+      <w:r>
+        <w:t xml:space="preserve">Every flex layout on the page is a Bootstrap utility class: d-flex flex-column align-items-start gap-2 (index.html lines 82, 107), d-flex gap-3 (line 121), and the entire navbar. No points lost for that. But you clearly can write layout CSS, because your Grid rule proves it. As a learning step, not a grading one, try writing the navbar yourself (display: flex; justify-content: center; gap). You will see exactly what navbar-expand-lg has been doing for you, and Project 2 gets easier.</w:t>
       </w:r>
     </w:p>
     <w:p>
@@ -2177,7 +2177,7 @@
       <w:r>
         <w:drawing>
           <wp:inline distT="0" distB="0" distL="0" distR="0">
-            <wp:extent cx="5762625" cy="3333750"/>
+            <wp:extent cx="5762625" cy="3762375"/>
             <wp:effectExtent t="0" r="0" b="0" l="0"/>
             <wp:docPr id="1" name="" descr="" title=""/>
             <wp:cNvGraphicFramePr>
@@ -2202,7 +2202,7 @@
                   <pic:spPr bwMode="auto">
                     <a:xfrm>
                       <a:off x="0" y="0"/>
-                      <a:ext cx="5762625" cy="3333750"/>
+                      <a:ext cx="5762625" cy="3762375"/>
                     </a:xfrm>
                     <a:prstGeom prst="rect">
                       <a:avLst/>
@@ -2228,7 +2228,7 @@
           <w:sz w:val="18"/>
           <w:szCs w:val="18"/>
         </w:rPr>
-        <w:t xml:space="preserve">Diagram 1. Where the layout on your page actually comes from. The brief grades the top box.</w:t>
+        <w:t xml:space="preserve">Diagram 1. Where the layout on your page comes from. Bootstrap is allowed; the Grid you wrote is excellent.</w:t>
       </w:r>
     </w:p>
     <w:p>
@@ -2853,7 +2853,7 @@
       <w:r>
         <w:drawing>
           <wp:inline distT="0" distB="0" distL="0" distR="0">
-            <wp:extent cx="5943600" cy="4724400"/>
+            <wp:extent cx="5943600" cy="3762375"/>
             <wp:effectExtent t="0" r="0" b="0" l="0"/>
             <wp:docPr id="1" name="" descr="" title=""/>
             <wp:cNvGraphicFramePr>
@@ -2878,7 +2878,7 @@
                   <pic:spPr bwMode="auto">
                     <a:xfrm>
                       <a:off x="0" y="0"/>
-                      <a:ext cx="5943600" cy="4724400"/>
+                      <a:ext cx="5943600" cy="3762375"/>
                     </a:xfrm>
                     <a:prstGeom prst="rect">
                       <a:avLst/>
@@ -2921,10 +2921,10 @@
           <w:b/>
           <w:bCs/>
         </w:rPr>
-        <w:t xml:space="preserve">Own the navbar. </w:t>
-      </w:r>
-      <w:r>
-        <w:t xml:space="preserve">Delete the Bootstrap navbar markup, write it with display: flex, and add a @media (min-width: 600px) for the desktop version. That is Flexbox and a media query in one move, and it is most of the missing points.</w:t>
+        <w:t xml:space="preserve">Finish the README. </w:t>
+      </w:r>
+      <w:r>
+        <w:t xml:space="preserve">Two sections, ten minutes, and it is the biggest single deduction left on the sheet.</w:t>
       </w:r>
     </w:p>
     <w:p>
@@ -2941,10 +2941,10 @@
           <w:b/>
           <w:bCs/>
         </w:rPr>
-        <w:t xml:space="preserve">Finish the README. </w:t>
-      </w:r>
-      <w:r>
-        <w:t xml:space="preserve">Two sections, ten minutes.</w:t>
+        <w:t xml:space="preserve">Write one media query of your own. </w:t>
+      </w:r>
+      <w:r>
+        <w:t xml:space="preserve">The header under 600px is the natural place. If you want the bigger lesson, rebuild the navbar with your own Flexbox while you are in there.</w:t>
       </w:r>
     </w:p>
     <w:p>
@@ -2980,7 +2980,7 @@
         <w:spacing w:after="120"/>
       </w:pPr>
       <w:r>
-        <w:t xml:space="preserve">Your instincts on accessibility and process are ahead of the class. Now put the same care into the CSS you are supposed to be practicing.</w:t>
+        <w:t xml:space="preserve">Your instincts on accessibility, layout and process are ahead of the class. Tighten the loose ends and this is a 90s project.</w:t>
       </w:r>
     </w:p>
     <w:p>

</xml_diff>